<commit_message>
Remove GSA MAS SIN 54151HEAL from branded docs (footer + title block)
Co-Authored-By: Claude Opus 4.8 <noreply@anthropic.com>
Claude-Session: https://claude.ai/code/session_01TCxmNzcRpa8VtR7L1ojUY6
</commit_message>
<xml_diff>
--- a/branded_docs/VBX_AIVendorStackAudit_MontanaMasterAI_v2_20260629.docx
+++ b/branded_docs/VBX_AIVendorStackAudit_MontanaMasterAI_v2_20260629.docx
@@ -217,7 +217,7 @@
           <w:sz w:val="18"/>
           <w:szCs w:val="18"/>
         </w:rPr>
-        <w:t xml:space="preserve">CAGE 9Z4X2  |  UEI H4X2Z7R9E3E3  |  GSA MAS SIN 54151HEAL</w:t>
+        <w:t>CAGE 9Z4X2  |  UEI H4X2Z7R9E3E3</w:t>
       </w:r>
     </w:p>
     <w:p>
@@ -28608,7 +28608,7 @@
         <w:sz w:val="16"/>
         <w:szCs w:val="16"/>
       </w:rPr>
-      <w:t xml:space="preserve">CAGE 9Z4X2  |  UEI H4X2Z7R9E3E3  |  GSA MAS SIN 54151HEAL  |  </w:t>
+      <w:t xml:space="preserve">CAGE 9Z4X2  |  UEI H4X2Z7R9E3E3  |  </w:t>
     </w:r>
     <w:r>
       <w:rPr>

</xml_diff>